<commit_message>
Updated the SOE - Enterprise Network Standards
Added the table borders to the document.
</commit_message>
<xml_diff>
--- a/downloads/SOE - Enterprise_Network_Standards_Guide.docx
+++ b/downloads/SOE - Enterprise_Network_Standards_Guide.docx
@@ -1,6 +1,6 @@
 
 <file path=word/document.xml><?xml version="1.0" encoding="utf-8"?>
-<w:document xmlns:wpc="http://schemas.microsoft.com/office/word/2010/wordprocessingCanvas" xmlns:mc="http://schemas.openxmlformats.org/markup-compatibility/2006" xmlns:o="urn:schemas-microsoft-com:office:office" xmlns:r="http://schemas.openxmlformats.org/officeDocument/2006/relationships" xmlns:m="http://schemas.openxmlformats.org/officeDocument/2006/math" xmlns:v="urn:schemas-microsoft-com:vml" xmlns:wp14="http://schemas.microsoft.com/office/word/2010/wordprocessingDrawing" xmlns:wp="http://schemas.openxmlformats.org/drawingml/2006/wordprocessingDrawing" xmlns:w10="urn:schemas-microsoft-com:office:word" xmlns:w="http://schemas.openxmlformats.org/wordprocessingml/2006/main" xmlns:w14="http://schemas.microsoft.com/office/word/2010/wordml" xmlns:w15="http://schemas.microsoft.com/office/word/2012/wordml" xmlns:wpg="http://schemas.microsoft.com/office/word/2010/wordprocessingGroup" xmlns:wpi="http://schemas.microsoft.com/office/word/2010/wordprocessingInk" xmlns:wne="http://schemas.microsoft.com/office/word/2006/wordml" xmlns:wps="http://schemas.microsoft.com/office/word/2010/wordprocessingShape" mc:Ignorable="w14 w15 wp14">
+<w:document xmlns:wpc="http://schemas.microsoft.com/office/word/2010/wordprocessingCanvas" xmlns:cx="http://schemas.microsoft.com/office/drawing/2014/chartex" xmlns:cx1="http://schemas.microsoft.com/office/drawing/2015/9/8/chartex" xmlns:cx2="http://schemas.microsoft.com/office/drawing/2015/10/21/chartex" xmlns:cx3="http://schemas.microsoft.com/office/drawing/2016/5/9/chartex" xmlns:cx4="http://schemas.microsoft.com/office/drawing/2016/5/10/chartex" xmlns:cx5="http://schemas.microsoft.com/office/drawing/2016/5/11/chartex" xmlns:cx6="http://schemas.microsoft.com/office/drawing/2016/5/12/chartex" xmlns:cx7="http://schemas.microsoft.com/office/drawing/2016/5/13/chartex" xmlns:cx8="http://schemas.microsoft.com/office/drawing/2016/5/14/chartex" xmlns:mc="http://schemas.openxmlformats.org/markup-compatibility/2006" xmlns:aink="http://schemas.microsoft.com/office/drawing/2016/ink" xmlns:am3d="http://schemas.microsoft.com/office/drawing/2017/model3d" xmlns:o="urn:schemas-microsoft-com:office:office" xmlns:oel="http://schemas.microsoft.com/office/2019/extlst" xmlns:r="http://schemas.openxmlformats.org/officeDocument/2006/relationships" xmlns:m="http://schemas.openxmlformats.org/officeDocument/2006/math" xmlns:v="urn:schemas-microsoft-com:vml" xmlns:wp14="http://schemas.microsoft.com/office/word/2010/wordprocessingDrawing" xmlns:wp="http://schemas.openxmlformats.org/drawingml/2006/wordprocessingDrawing" xmlns:w10="urn:schemas-microsoft-com:office:word" xmlns:w="http://schemas.openxmlformats.org/wordprocessingml/2006/main" xmlns:w14="http://schemas.microsoft.com/office/word/2010/wordml" xmlns:w15="http://schemas.microsoft.com/office/word/2012/wordml" xmlns:w16cex="http://schemas.microsoft.com/office/word/2018/wordml/cex" xmlns:w16cid="http://schemas.microsoft.com/office/word/2016/wordml/cid" xmlns:w16="http://schemas.microsoft.com/office/word/2018/wordml" xmlns:w16sdtdh="http://schemas.microsoft.com/office/word/2020/wordml/sdtdatahash" xmlns:w16se="http://schemas.microsoft.com/office/word/2015/wordml/symex" xmlns:wpg="http://schemas.microsoft.com/office/word/2010/wordprocessingGroup" xmlns:wpi="http://schemas.microsoft.com/office/word/2010/wordprocessingInk" xmlns:wne="http://schemas.microsoft.com/office/word/2006/wordml" xmlns:wps="http://schemas.microsoft.com/office/word/2010/wordprocessingShape" mc:Ignorable="w14 w15 w16se w16cid w16 w16cex w16sdtdh wp14">
   <w:body>
     <w:p>
       <w:pPr>
@@ -205,7 +205,7 @@
         <w:rPr>
           <w:color w:val="4F6228" w:themeColor="accent3" w:themeShade="80"/>
         </w:rPr>
-        <w:pict>
+        <w:pict w14:anchorId="0A2782DD">
           <v:rect id="_x0000_i1025" style="width:468pt;height:2.5pt" o:hralign="center" o:hrstd="t" o:hrnoshade="t" o:hr="t" fillcolor="#4e6128 [1606]" stroked="f"/>
         </w:pict>
       </w:r>
@@ -254,7 +254,7 @@
         <w:rPr>
           <w:color w:val="4F6228" w:themeColor="accent3" w:themeShade="80"/>
         </w:rPr>
-        <w:pict>
+        <w:pict w14:anchorId="28D41CFF">
           <v:rect id="_x0000_i1026" style="width:468pt;height:2.5pt" o:hralign="center" o:hrstd="t" o:hrnoshade="t" o:hr="t" fillcolor="#4e6128 [1606]" stroked="f"/>
         </w:pict>
       </w:r>
@@ -359,7 +359,7 @@
         <w:rPr>
           <w:color w:val="4F6228" w:themeColor="accent3" w:themeShade="80"/>
         </w:rPr>
-        <w:pict>
+        <w:pict w14:anchorId="6C692BC4">
           <v:rect id="_x0000_i1027" style="width:468pt;height:2.5pt" o:hralign="center" o:hrstd="t" o:hrnoshade="t" o:hr="t" fillcolor="#4e6128 [1606]" stroked="f"/>
         </w:pict>
       </w:r>
@@ -491,7 +491,7 @@
         <w:pStyle w:val="Heading2"/>
       </w:pPr>
       <w:r>
-        <w:pict>
+        <w:pict w14:anchorId="19C0E2D6">
           <v:rect id="_x0000_i1028" style="width:468pt;height:2.5pt" o:hralign="center" o:hrstd="t" o:hrnoshade="t" o:hr="t" fillcolor="#4e6128 [1606]" stroked="f"/>
         </w:pict>
       </w:r>
@@ -670,6 +670,14 @@
       <w:tblPr>
         <w:tblW w:w="5000" w:type="pct"/>
         <w:tblCellSpacing w:w="15" w:type="dxa"/>
+        <w:tblBorders>
+          <w:top w:val="single" w:sz="4" w:space="0" w:color="auto"/>
+          <w:left w:val="single" w:sz="4" w:space="0" w:color="auto"/>
+          <w:bottom w:val="single" w:sz="4" w:space="0" w:color="auto"/>
+          <w:right w:val="single" w:sz="4" w:space="0" w:color="auto"/>
+          <w:insideH w:val="single" w:sz="4" w:space="0" w:color="auto"/>
+          <w:insideV w:val="single" w:sz="4" w:space="0" w:color="auto"/>
+        </w:tblBorders>
         <w:tblCellMar>
           <w:top w:w="72" w:type="dxa"/>
           <w:left w:w="115" w:type="dxa"/>
@@ -681,8 +689,8 @@
         <w:tblDescription w:val="Table defining the standard VLAN assignments for the Sonoran Outdoor Equipment enterprise network. Each VLAN number is associated with a department or network function, including Executive, Human Resources, Accounting and Finance, Sales and Customer Service, Information Technology, Warehouse and Inventory, IoT and Security Systems, Voice, Guest Wireless, and Network Management."/>
       </w:tblPr>
       <w:tblGrid>
-        <w:gridCol w:w="4680"/>
-        <w:gridCol w:w="4680"/>
+        <w:gridCol w:w="4675"/>
+        <w:gridCol w:w="4675"/>
       </w:tblGrid>
       <w:tr>
         <w:trPr>
@@ -1092,7 +1100,7 @@
         <w:rPr>
           <w:color w:val="4F6228" w:themeColor="accent3" w:themeShade="80"/>
         </w:rPr>
-        <w:pict>
+        <w:pict w14:anchorId="17CADD1F">
           <v:rect id="_x0000_i1029" style="width:468pt;height:2.5pt" o:hralign="center" o:hrstd="t" o:hrnoshade="t" o:hr="t" fillcolor="#4e6128 [1606]" stroked="f"/>
         </w:pict>
       </w:r>
@@ -1282,7 +1290,7 @@
         <w:rPr>
           <w:color w:val="4F6228" w:themeColor="accent3" w:themeShade="80"/>
         </w:rPr>
-        <w:pict>
+        <w:pict w14:anchorId="5C91BCA3">
           <v:rect id="_x0000_i1030" style="width:468pt;height:2.5pt" o:hralign="center" o:hrstd="t" o:hrnoshade="t" o:hr="t" fillcolor="#4e6128 [1606]" stroked="f"/>
         </w:pict>
       </w:r>
@@ -1325,6 +1333,14 @@
       <w:tblPr>
         <w:tblW w:w="5000" w:type="pct"/>
         <w:tblCellSpacing w:w="15" w:type="dxa"/>
+        <w:tblBorders>
+          <w:top w:val="single" w:sz="4" w:space="0" w:color="auto"/>
+          <w:left w:val="single" w:sz="4" w:space="0" w:color="auto"/>
+          <w:bottom w:val="single" w:sz="4" w:space="0" w:color="auto"/>
+          <w:right w:val="single" w:sz="4" w:space="0" w:color="auto"/>
+          <w:insideH w:val="single" w:sz="4" w:space="0" w:color="auto"/>
+          <w:insideV w:val="single" w:sz="4" w:space="0" w:color="auto"/>
+        </w:tblBorders>
         <w:tblCellMar>
           <w:top w:w="72" w:type="dxa"/>
           <w:left w:w="115" w:type="dxa"/>
@@ -1336,9 +1352,9 @@
         <w:tblDescription w:val="Required enterprise device naming standards. Each row lists a network device and its required Device Name and Hostname. Phoenix Headquarters Router uses HQ-R1, Phoenix Headquarters Switch uses HQ-S1, Tucson Distribution Router uses TUC-R2, Tucson Distribution Switch uses TUC-S2, Flagstaff Retail Router uses FLG-R3, and Flagstaff Retail Switch uses FLG-S3. The Device Name and Hostname must match exactly for all devices."/>
       </w:tblPr>
       <w:tblGrid>
-        <w:gridCol w:w="4538"/>
-        <w:gridCol w:w="2411"/>
-        <w:gridCol w:w="2411"/>
+        <w:gridCol w:w="4534"/>
+        <w:gridCol w:w="2408"/>
+        <w:gridCol w:w="2408"/>
       </w:tblGrid>
       <w:tr>
         <w:trPr>
@@ -1813,6 +1829,14 @@
       <w:tblPr>
         <w:tblW w:w="5000" w:type="pct"/>
         <w:tblCellSpacing w:w="15" w:type="dxa"/>
+        <w:tblBorders>
+          <w:top w:val="single" w:sz="4" w:space="0" w:color="auto"/>
+          <w:left w:val="single" w:sz="4" w:space="0" w:color="auto"/>
+          <w:bottom w:val="single" w:sz="4" w:space="0" w:color="auto"/>
+          <w:right w:val="single" w:sz="4" w:space="0" w:color="auto"/>
+          <w:insideH w:val="single" w:sz="4" w:space="0" w:color="auto"/>
+          <w:insideV w:val="single" w:sz="4" w:space="0" w:color="auto"/>
+        </w:tblBorders>
         <w:tblCellMar>
           <w:top w:w="72" w:type="dxa"/>
           <w:left w:w="115" w:type="dxa"/>
@@ -1824,8 +1848,8 @@
         <w:tblDescription w:val="Table defining the standard VLAN assignments for the Sonoran Outdoor Equipment enterprise network. Each VLAN number is associated with a department or network function, including Executive, Human Resources, Accounting and Finance, Sales and Customer Service, Information Technology, Warehouse and Inventory, IoT and Security Systems, Voice, Guest Wireless, and Network Management."/>
       </w:tblPr>
       <w:tblGrid>
-        <w:gridCol w:w="4680"/>
-        <w:gridCol w:w="4680"/>
+        <w:gridCol w:w="4675"/>
+        <w:gridCol w:w="4675"/>
       </w:tblGrid>
       <w:tr>
         <w:trPr>
@@ -2046,7 +2070,6 @@
           </w:tcPr>
           <w:p>
             <w:r>
-              <w:lastRenderedPageBreak/>
               <w:t>Security Camera</w:t>
             </w:r>
           </w:p>
@@ -2075,13 +2098,8 @@
             <w:hideMark/>
           </w:tcPr>
           <w:p>
-            <w:proofErr w:type="spellStart"/>
-            <w:r>
-              <w:t>IoT</w:t>
-            </w:r>
-            <w:proofErr w:type="spellEnd"/>
-            <w:r>
-              <w:t xml:space="preserve"> Device</w:t>
+            <w:r>
+              <w:t>IoT Device</w:t>
             </w:r>
           </w:p>
         </w:tc>
@@ -2169,6 +2187,14 @@
       <w:tblPr>
         <w:tblW w:w="5000" w:type="pct"/>
         <w:tblCellSpacing w:w="15" w:type="dxa"/>
+        <w:tblBorders>
+          <w:top w:val="single" w:sz="4" w:space="0" w:color="auto"/>
+          <w:left w:val="single" w:sz="4" w:space="0" w:color="auto"/>
+          <w:bottom w:val="single" w:sz="4" w:space="0" w:color="auto"/>
+          <w:right w:val="single" w:sz="4" w:space="0" w:color="auto"/>
+          <w:insideH w:val="single" w:sz="4" w:space="0" w:color="auto"/>
+          <w:insideV w:val="single" w:sz="4" w:space="0" w:color="auto"/>
+        </w:tblBorders>
         <w:tblCellMar>
           <w:top w:w="72" w:type="dxa"/>
           <w:left w:w="115" w:type="dxa"/>
@@ -2180,8 +2206,8 @@
         <w:tblDescription w:val="Table defining the standard VLAN assignments for the Sonoran Outdoor Equipment enterprise network. Each VLAN number is associated with a department or network function, including Executive, Human Resources, Accounting and Finance, Sales and Customer Service, Information Technology, Warehouse and Inventory, IoT and Security Systems, Voice, Guest Wireless, and Network Management."/>
       </w:tblPr>
       <w:tblGrid>
-        <w:gridCol w:w="4680"/>
-        <w:gridCol w:w="4680"/>
+        <w:gridCol w:w="4675"/>
+        <w:gridCol w:w="4675"/>
       </w:tblGrid>
       <w:tr>
         <w:trPr>
@@ -2519,6 +2545,14 @@
       <w:tblPr>
         <w:tblW w:w="5000" w:type="pct"/>
         <w:tblCellSpacing w:w="15" w:type="dxa"/>
+        <w:tblBorders>
+          <w:top w:val="single" w:sz="4" w:space="0" w:color="auto"/>
+          <w:left w:val="single" w:sz="4" w:space="0" w:color="auto"/>
+          <w:bottom w:val="single" w:sz="4" w:space="0" w:color="auto"/>
+          <w:right w:val="single" w:sz="4" w:space="0" w:color="auto"/>
+          <w:insideH w:val="single" w:sz="4" w:space="0" w:color="auto"/>
+          <w:insideV w:val="single" w:sz="4" w:space="0" w:color="auto"/>
+        </w:tblBorders>
         <w:tblCellMar>
           <w:top w:w="72" w:type="dxa"/>
           <w:left w:w="115" w:type="dxa"/>
@@ -2530,8 +2564,8 @@
         <w:tblDescription w:val="Table defining the standard VLAN assignments for the Sonoran Outdoor Equipment enterprise network. Each VLAN number is associated with a department or network function, including Executive, Human Resources, Accounting and Finance, Sales and Customer Service, Information Technology, Warehouse and Inventory, IoT and Security Systems, Voice, Guest Wireless, and Network Management."/>
       </w:tblPr>
       <w:tblGrid>
-        <w:gridCol w:w="4680"/>
-        <w:gridCol w:w="4680"/>
+        <w:gridCol w:w="4675"/>
+        <w:gridCol w:w="4675"/>
       </w:tblGrid>
       <w:tr>
         <w:trPr>
@@ -2703,6 +2737,14 @@
       <w:tblPr>
         <w:tblW w:w="5000" w:type="pct"/>
         <w:tblCellSpacing w:w="15" w:type="dxa"/>
+        <w:tblBorders>
+          <w:top w:val="single" w:sz="4" w:space="0" w:color="auto"/>
+          <w:left w:val="single" w:sz="4" w:space="0" w:color="auto"/>
+          <w:bottom w:val="single" w:sz="4" w:space="0" w:color="auto"/>
+          <w:right w:val="single" w:sz="4" w:space="0" w:color="auto"/>
+          <w:insideH w:val="single" w:sz="4" w:space="0" w:color="auto"/>
+          <w:insideV w:val="single" w:sz="4" w:space="0" w:color="auto"/>
+        </w:tblBorders>
         <w:tblCellMar>
           <w:top w:w="72" w:type="dxa"/>
           <w:left w:w="115" w:type="dxa"/>
@@ -2714,8 +2756,8 @@
         <w:tblDescription w:val="Table defining the standard VLAN assignments for the Sonoran Outdoor Equipment enterprise network. Each VLAN number is associated with a department or network function, including Executive, Human Resources, Accounting and Finance, Sales and Customer Service, Information Technology, Warehouse and Inventory, IoT and Security Systems, Voice, Guest Wireless, and Network Management."/>
       </w:tblPr>
       <w:tblGrid>
-        <w:gridCol w:w="4680"/>
-        <w:gridCol w:w="4680"/>
+        <w:gridCol w:w="4675"/>
+        <w:gridCol w:w="4675"/>
       </w:tblGrid>
       <w:tr>
         <w:trPr>
@@ -2746,7 +2788,6 @@
                 <w:sz w:val="28"/>
                 <w:szCs w:val="28"/>
               </w:rPr>
-              <w:lastRenderedPageBreak/>
               <w:t>De</w:t>
             </w:r>
             <w:r>
@@ -3106,15 +3147,7 @@
           </w:tcPr>
           <w:p>
             <w:r>
-              <w:t xml:space="preserve">Warehouse </w:t>
-            </w:r>
-            <w:proofErr w:type="spellStart"/>
-            <w:r>
-              <w:t>IoT</w:t>
-            </w:r>
-            <w:proofErr w:type="spellEnd"/>
-            <w:r>
-              <w:t xml:space="preserve"> Sensor</w:t>
+              <w:t>Warehouse IoT Sensor</w:t>
             </w:r>
           </w:p>
         </w:tc>
@@ -3170,7 +3203,7 @@
         <w:rPr>
           <w:color w:val="4F6228" w:themeColor="accent3" w:themeShade="80"/>
         </w:rPr>
-        <w:pict>
+        <w:pict w14:anchorId="5DFE92E7">
           <v:rect id="_x0000_i1031" style="width:468pt;height:2.5pt" o:hralign="center" o:hrstd="t" o:hrnoshade="t" o:hr="t" fillcolor="#4e6128 [1606]" stroked="f"/>
         </w:pict>
       </w:r>
@@ -3256,7 +3289,6 @@
         <w:spacing w:before="100" w:beforeAutospacing="1" w:after="100" w:afterAutospacing="1" w:line="276" w:lineRule="auto"/>
       </w:pPr>
       <w:r>
-        <w:lastRenderedPageBreak/>
         <w:t>Course identifier</w:t>
       </w:r>
       <w:r>
@@ -3349,13 +3381,8 @@
       </w:r>
       <w:r>
         <w:br/>
-        <w:t xml:space="preserve">Director of Network Engineering: Andrea </w:t>
-      </w:r>
-      <w:proofErr w:type="spellStart"/>
-      <w:r>
-        <w:t>Schauer</w:t>
-      </w:r>
-      <w:proofErr w:type="spellEnd"/>
+        <w:t>Director of Network Engineering: Andrea Schauer</w:t>
+      </w:r>
       <w:r>
         <w:br/>
       </w:r>
@@ -3388,7 +3415,7 @@
         <w:rPr>
           <w:color w:val="4F6228" w:themeColor="accent3" w:themeShade="80"/>
         </w:rPr>
-        <w:pict>
+        <w:pict w14:anchorId="0A569205">
           <v:rect id="_x0000_i1032" style="width:468pt;height:2.5pt" o:hralign="center" o:hrstd="t" o:hrnoshade="t" o:hr="t" fillcolor="#4e6128 [1606]" stroked="f"/>
         </w:pict>
       </w:r>
@@ -3511,7 +3538,7 @@
         <w:rPr>
           <w:color w:val="4F6228" w:themeColor="accent3" w:themeShade="80"/>
         </w:rPr>
-        <w:pict>
+        <w:pict w14:anchorId="362C8516">
           <v:rect id="_x0000_i1033" style="width:468pt;height:2.5pt" o:hralign="center" o:hrstd="t" o:hrnoshade="t" o:hr="t" fillcolor="#4e6128 [1606]" stroked="f"/>
         </w:pict>
       </w:r>
@@ -3535,7 +3562,6 @@
         <w:spacing w:before="100" w:beforeAutospacing="1" w:after="100" w:afterAutospacing="1"/>
       </w:pPr>
       <w:r>
-        <w:lastRenderedPageBreak/>
         <w:t>Enterprise documentation shall be updated when an Enterprise Change Request changes information represented in that documentation. Not every ECR requires changes to every enterprise document. The Enterprise Network Standards Guide should be updated only when an approved change establishes, modifies, or retires an enterprise standard.</w:t>
       </w:r>
     </w:p>
@@ -3633,7 +3659,7 @@
         <w:rPr>
           <w:color w:val="4F6228" w:themeColor="accent3" w:themeShade="80"/>
         </w:rPr>
-        <w:pict>
+        <w:pict w14:anchorId="64FA6A77">
           <v:rect id="_x0000_i1034" style="width:468pt;height:2.5pt" o:hralign="center" o:hrstd="t" o:hrnoshade="t" o:hr="t" fillcolor="#4e6128 [1606]" stroked="f"/>
         </w:pict>
       </w:r>
@@ -3718,15 +3744,7 @@
         <w:spacing w:line="276" w:lineRule="auto"/>
       </w:pPr>
       <w:r>
-        <w:t>Highlight required configuration items in submitted show running-</w:t>
-      </w:r>
-      <w:proofErr w:type="spellStart"/>
-      <w:r>
-        <w:t>config</w:t>
-      </w:r>
-      <w:proofErr w:type="spellEnd"/>
-      <w:r>
-        <w:t xml:space="preserve"> outputs when directed by the Enterprise Change Request.</w:t>
+        <w:t>Highlight required configuration items in submitted show running-config outputs when directed by the Enterprise Change Request.</w:t>
       </w:r>
     </w:p>
     <w:p>
@@ -3915,6 +3933,14 @@
       <w:tblPr>
         <w:tblW w:w="5000" w:type="pct"/>
         <w:tblCellSpacing w:w="15" w:type="dxa"/>
+        <w:tblBorders>
+          <w:top w:val="single" w:sz="4" w:space="0" w:color="auto"/>
+          <w:left w:val="single" w:sz="4" w:space="0" w:color="auto"/>
+          <w:bottom w:val="single" w:sz="4" w:space="0" w:color="auto"/>
+          <w:right w:val="single" w:sz="4" w:space="0" w:color="auto"/>
+          <w:insideH w:val="single" w:sz="4" w:space="0" w:color="auto"/>
+          <w:insideV w:val="single" w:sz="4" w:space="0" w:color="auto"/>
+        </w:tblBorders>
         <w:tblCellMar>
           <w:top w:w="72" w:type="dxa"/>
           <w:left w:w="115" w:type="dxa"/>
@@ -3925,7 +3951,7 @@
       </w:tblPr>
       <w:tblGrid>
         <w:gridCol w:w="4097"/>
-        <w:gridCol w:w="5263"/>
+        <w:gridCol w:w="5253"/>
       </w:tblGrid>
       <w:tr>
         <w:trPr>
@@ -4329,7 +4355,7 @@
         <w:rPr>
           <w:color w:val="4F6228" w:themeColor="accent3" w:themeShade="80"/>
         </w:rPr>
-        <w:pict>
+        <w:pict w14:anchorId="75D35063">
           <v:rect id="_x0000_i1035" style="width:468pt;height:2.5pt" o:hralign="center" o:hrstd="t" o:hrnoshade="t" o:hr="t" fillcolor="#4e6128 [1606]" stroked="f"/>
         </w:pict>
       </w:r>
@@ -4373,6 +4399,14 @@
       <w:tblPr>
         <w:tblW w:w="5000" w:type="pct"/>
         <w:tblCellSpacing w:w="15" w:type="dxa"/>
+        <w:tblBorders>
+          <w:top w:val="single" w:sz="4" w:space="0" w:color="auto"/>
+          <w:left w:val="single" w:sz="4" w:space="0" w:color="auto"/>
+          <w:bottom w:val="single" w:sz="4" w:space="0" w:color="auto"/>
+          <w:right w:val="single" w:sz="4" w:space="0" w:color="auto"/>
+          <w:insideH w:val="single" w:sz="4" w:space="0" w:color="auto"/>
+          <w:insideV w:val="single" w:sz="4" w:space="0" w:color="auto"/>
+        </w:tblBorders>
         <w:tblCellMar>
           <w:top w:w="72" w:type="dxa"/>
           <w:left w:w="115" w:type="dxa"/>
@@ -4384,9 +4418,9 @@
         <w:tblDescription w:val="Table defining the standard interface assignments for HQ-R1, the Phoenix Headquarters router. The table identifies each local interface, the connected device, and the corresponding remote interface used throughout the enterprise network."/>
       </w:tblPr>
       <w:tblGrid>
-        <w:gridCol w:w="2118"/>
-        <w:gridCol w:w="1842"/>
-        <w:gridCol w:w="5400"/>
+        <w:gridCol w:w="2123"/>
+        <w:gridCol w:w="1849"/>
+        <w:gridCol w:w="5378"/>
       </w:tblGrid>
       <w:tr>
         <w:trPr>
@@ -4417,7 +4451,6 @@
                 <w:sz w:val="28"/>
                 <w:szCs w:val="28"/>
               </w:rPr>
-              <w:lastRenderedPageBreak/>
               <w:t>ACL Number</w:t>
             </w:r>
           </w:p>
@@ -4681,7 +4714,7 @@
     </w:p>
     <w:p>
       <w:r>
-        <w:pict>
+        <w:pict w14:anchorId="46BFDB27">
           <v:rect id="_x0000_i1036" style="width:468pt;height:2pt" o:hralign="center" o:hrstd="t" o:hrnoshade="t" o:hr="t" fillcolor="#974706 [1609]" stroked="f"/>
         </w:pict>
       </w:r>
@@ -4714,6 +4747,14 @@
       <w:tblPr>
         <w:tblW w:w="5000" w:type="pct"/>
         <w:tblCellSpacing w:w="15" w:type="dxa"/>
+        <w:tblBorders>
+          <w:top w:val="single" w:sz="4" w:space="0" w:color="auto"/>
+          <w:left w:val="single" w:sz="4" w:space="0" w:color="auto"/>
+          <w:bottom w:val="single" w:sz="4" w:space="0" w:color="auto"/>
+          <w:right w:val="single" w:sz="4" w:space="0" w:color="auto"/>
+          <w:insideH w:val="single" w:sz="4" w:space="0" w:color="auto"/>
+          <w:insideV w:val="single" w:sz="4" w:space="0" w:color="auto"/>
+        </w:tblBorders>
         <w:tblCellMar>
           <w:top w:w="72" w:type="dxa"/>
           <w:left w:w="115" w:type="dxa"/>
@@ -4725,9 +4766,9 @@
         <w:tblDescription w:val="Table defining the standard interface assignments for HQ-R1, the Phoenix Headquarters router. The table identifies each local interface, the connected device, and the corresponding remote interface used throughout the enterprise network."/>
       </w:tblPr>
       <w:tblGrid>
-        <w:gridCol w:w="3312"/>
-        <w:gridCol w:w="1849"/>
-        <w:gridCol w:w="4199"/>
+        <w:gridCol w:w="3307"/>
+        <w:gridCol w:w="1856"/>
+        <w:gridCol w:w="4187"/>
       </w:tblGrid>
       <w:tr>
         <w:trPr>
@@ -5018,7 +5059,7 @@
     </w:p>
     <w:p>
       <w:r>
-        <w:pict>
+        <w:pict w14:anchorId="4947444E">
           <v:rect id="_x0000_i1037" style="width:468pt;height:2pt" o:hralign="center" o:hrstd="t" o:hrnoshade="t" o:hr="t" fillcolor="#974706 [1609]" stroked="f"/>
         </w:pict>
       </w:r>
@@ -5028,7 +5069,6 @@
         <w:pStyle w:val="Heading3"/>
       </w:pPr>
       <w:r>
-        <w:lastRenderedPageBreak/>
         <w:t>Enterprise ACL Placement Standards</w:t>
       </w:r>
     </w:p>
@@ -5102,7 +5142,7 @@
     </w:p>
     <w:p>
       <w:r>
-        <w:pict>
+        <w:pict w14:anchorId="4E1435B5">
           <v:rect id="_x0000_i1038" style="width:468pt;height:2pt" o:hralign="center" o:hrstd="t" o:hrnoshade="t" o:hr="t" fillcolor="#974706 [1609]" stroked="f"/>
         </w:pict>
       </w:r>
@@ -5263,7 +5303,6 @@
         <w:spacing w:before="100" w:beforeAutospacing="1" w:after="100" w:afterAutospacing="1" w:line="276" w:lineRule="auto"/>
       </w:pPr>
       <w:r>
-        <w:lastRenderedPageBreak/>
         <w:t xml:space="preserve">Only Executive </w:t>
       </w:r>
       <w:r>
@@ -5369,7 +5408,7 @@
         <w:rPr>
           <w:color w:val="4F6228" w:themeColor="accent3" w:themeShade="80"/>
         </w:rPr>
-        <w:pict>
+        <w:pict w14:anchorId="785D44A1">
           <v:rect id="_x0000_i1039" style="width:468pt;height:2.5pt" o:hralign="center" o:hrstd="t" o:hrnoshade="t" o:hr="t" fillcolor="#4e6128 [1606]" stroked="f"/>
         </w:pict>
       </w:r>
@@ -5386,6 +5425,14 @@
       <w:tblPr>
         <w:tblW w:w="0" w:type="auto"/>
         <w:tblCellSpacing w:w="15" w:type="dxa"/>
+        <w:tblBorders>
+          <w:top w:val="single" w:sz="4" w:space="0" w:color="auto"/>
+          <w:left w:val="single" w:sz="4" w:space="0" w:color="auto"/>
+          <w:bottom w:val="single" w:sz="4" w:space="0" w:color="auto"/>
+          <w:right w:val="single" w:sz="4" w:space="0" w:color="auto"/>
+          <w:insideH w:val="single" w:sz="4" w:space="0" w:color="auto"/>
+          <w:insideV w:val="single" w:sz="4" w:space="0" w:color="auto"/>
+        </w:tblBorders>
         <w:tblCellMar>
           <w:top w:w="72" w:type="dxa"/>
           <w:left w:w="115" w:type="dxa"/>
@@ -5397,9 +5444,9 @@
         <w:tblDescription w:val="Table defining the standard VLAN assignments for the Sonoran Outdoor Equipment enterprise network. Each VLAN number is associated with a department or network function, including Executive, Human Resources, Accounting and Finance, Sales and Customer Service, Information Technology, Warehouse and Inventory, IoT and Security Systems, Voice, Guest Wireless, and Network Management."/>
       </w:tblPr>
       <w:tblGrid>
-        <w:gridCol w:w="1913"/>
-        <w:gridCol w:w="3835"/>
-        <w:gridCol w:w="3612"/>
+        <w:gridCol w:w="1911"/>
+        <w:gridCol w:w="3832"/>
+        <w:gridCol w:w="3607"/>
       </w:tblGrid>
       <w:tr>
         <w:trPr>
@@ -5828,13 +5875,8 @@
             <w:vAlign w:val="center"/>
           </w:tcPr>
           <w:p>
-            <w:proofErr w:type="spellStart"/>
-            <w:r>
-              <w:t>IoT</w:t>
-            </w:r>
-            <w:proofErr w:type="spellEnd"/>
-            <w:r>
-              <w:t xml:space="preserve"> &amp; Security Systems</w:t>
+            <w:r>
+              <w:t>IoT &amp; Security Systems</w:t>
             </w:r>
           </w:p>
         </w:tc>
@@ -6028,8 +6070,7 @@
         <w:pStyle w:val="Heading3"/>
       </w:pPr>
       <w:r>
-        <w:lastRenderedPageBreak/>
-        <w:pict>
+        <w:pict w14:anchorId="2D1ED990">
           <v:rect id="_x0000_i1040" style="width:468pt;height:2pt" o:hralign="center" o:hrstd="t" o:hrnoshade="t" o:hr="t" fillcolor="#974706 [1609]" stroked="f"/>
         </w:pict>
       </w:r>
@@ -6107,7 +6148,7 @@
     </w:p>
     <w:p>
       <w:r>
-        <w:pict>
+        <w:pict w14:anchorId="138D3392">
           <v:rect id="_x0000_i1041" style="width:468pt;height:2pt" o:hralign="center" o:hrstd="t" o:hrnoshade="t" o:hr="t" fillcolor="#974706 [1609]" stroked="f"/>
         </w:pict>
       </w:r>
@@ -6263,15 +6304,7 @@
         <w:spacing w:line="276" w:lineRule="auto"/>
       </w:pPr>
       <w:r>
-        <w:t xml:space="preserve">VLAN 70 – </w:t>
-      </w:r>
-      <w:proofErr w:type="spellStart"/>
-      <w:r>
-        <w:t>IoT</w:t>
-      </w:r>
-      <w:proofErr w:type="spellEnd"/>
-      <w:r>
-        <w:t xml:space="preserve"> &amp; Security Systems </w:t>
+        <w:t xml:space="preserve">VLAN 70 – IoT &amp; Security Systems </w:t>
       </w:r>
     </w:p>
     <w:p>
@@ -6320,11 +6353,7 @@
         <w:t>Reserved</w:t>
       </w:r>
       <w:r>
-        <w:t xml:space="preserve"> VLAN must be preconfigured as access ports and assigned to their designated VLAN. Reserved interfaces must include the required interface description </w:t>
-      </w:r>
-      <w:r>
-        <w:lastRenderedPageBreak/>
-        <w:t>and remain administratively shut down until activated by a future Enterprise Change Request (ECR).</w:t>
+        <w:t xml:space="preserve"> VLAN must be preconfigured as access ports and assigned to their designated VLAN. Reserved interfaces must include the required interface description and remain administratively shut down until activated by a future Enterprise Change Request (ECR).</w:t>
       </w:r>
     </w:p>
     <w:p>
@@ -6337,7 +6366,7 @@
     </w:p>
     <w:p>
       <w:r>
-        <w:pict>
+        <w:pict w14:anchorId="2B001BBE">
           <v:rect id="_x0000_i1042" style="width:468pt;height:2pt" o:hralign="center" o:hrstd="t" o:hrnoshade="t" o:hr="t" fillcolor="#974706 [1609]" stroked="f"/>
         </w:pict>
       </w:r>
@@ -6491,7 +6520,7 @@
     </w:p>
     <w:p>
       <w:r>
-        <w:pict>
+        <w:pict w14:anchorId="3E35083D">
           <v:rect id="_x0000_i1043" style="width:468pt;height:2pt" o:hralign="center" o:hrstd="t" o:hrnoshade="t" o:hr="t" fillcolor="#974706 [1609]" stroked="f"/>
         </w:pict>
       </w:r>
@@ -6590,7 +6619,6 @@
         <w:pStyle w:val="pdq2pgselectionanchorcontainer"/>
       </w:pPr>
       <w:r>
-        <w:lastRenderedPageBreak/>
         <w:t xml:space="preserve">During the initial enterprise deployment, the Flagstaff Retail Store operates as a </w:t>
       </w:r>
       <w:r>
@@ -6634,7 +6662,7 @@
         <w:spacing w:after="0" w:afterAutospacing="0"/>
       </w:pPr>
       <w:r>
-        <w:pict>
+        <w:pict w14:anchorId="1389D931">
           <v:rect id="_x0000_i1044" style="width:468pt;height:2.5pt" o:hralign="center" o:hrstd="t" o:hrnoshade="t" o:hr="t" fillcolor="#4e6128 [1606]" stroked="f"/>
         </w:pict>
       </w:r>
@@ -6685,6 +6713,14 @@
       <w:tblPr>
         <w:tblW w:w="0" w:type="auto"/>
         <w:tblCellSpacing w:w="15" w:type="dxa"/>
+        <w:tblBorders>
+          <w:top w:val="single" w:sz="4" w:space="0" w:color="auto"/>
+          <w:left w:val="single" w:sz="4" w:space="0" w:color="auto"/>
+          <w:bottom w:val="single" w:sz="4" w:space="0" w:color="auto"/>
+          <w:right w:val="single" w:sz="4" w:space="0" w:color="auto"/>
+          <w:insideH w:val="single" w:sz="4" w:space="0" w:color="auto"/>
+          <w:insideV w:val="single" w:sz="4" w:space="0" w:color="auto"/>
+        </w:tblBorders>
         <w:tblCellMar>
           <w:top w:w="72" w:type="dxa"/>
           <w:left w:w="115" w:type="dxa"/>
@@ -6696,9 +6732,9 @@
         <w:tblDescription w:val="Table defining the standard interface assignments for HQ-R1, the Phoenix Headquarters router. The table identifies each local interface, the connected device, and the corresponding remote interface used throughout the enterprise network."/>
       </w:tblPr>
       <w:tblGrid>
-        <w:gridCol w:w="2103"/>
-        <w:gridCol w:w="2666"/>
-        <w:gridCol w:w="2351"/>
+        <w:gridCol w:w="2123"/>
+        <w:gridCol w:w="2686"/>
+        <w:gridCol w:w="2371"/>
       </w:tblGrid>
       <w:tr>
         <w:trPr>
@@ -7188,6 +7224,14 @@
       <w:tblPr>
         <w:tblW w:w="0" w:type="auto"/>
         <w:tblCellSpacing w:w="15" w:type="dxa"/>
+        <w:tblBorders>
+          <w:top w:val="single" w:sz="4" w:space="0" w:color="auto"/>
+          <w:left w:val="single" w:sz="4" w:space="0" w:color="auto"/>
+          <w:bottom w:val="single" w:sz="4" w:space="0" w:color="auto"/>
+          <w:right w:val="single" w:sz="4" w:space="0" w:color="auto"/>
+          <w:insideH w:val="single" w:sz="4" w:space="0" w:color="auto"/>
+          <w:insideV w:val="single" w:sz="4" w:space="0" w:color="auto"/>
+        </w:tblBorders>
         <w:tblCellMar>
           <w:top w:w="72" w:type="dxa"/>
           <w:left w:w="115" w:type="dxa"/>
@@ -7199,9 +7243,9 @@
         <w:tblDescription w:val="Table defining the standard interface assignments for HQ-R1, the Phoenix Headquarters router. The table identifies each local interface, the connected device, and the corresponding remote interface used throughout the enterprise network."/>
       </w:tblPr>
       <w:tblGrid>
-        <w:gridCol w:w="2103"/>
-        <w:gridCol w:w="4140"/>
-        <w:gridCol w:w="2351"/>
+        <w:gridCol w:w="2123"/>
+        <w:gridCol w:w="4160"/>
+        <w:gridCol w:w="2371"/>
       </w:tblGrid>
       <w:tr>
         <w:trPr>
@@ -7234,7 +7278,6 @@
                 <w:sz w:val="28"/>
                 <w:szCs w:val="28"/>
               </w:rPr>
-              <w:lastRenderedPageBreak/>
               <w:t>Local Interface</w:t>
             </w:r>
           </w:p>
@@ -7467,6 +7510,14 @@
       <w:tblPr>
         <w:tblW w:w="0" w:type="auto"/>
         <w:tblCellSpacing w:w="15" w:type="dxa"/>
+        <w:tblBorders>
+          <w:top w:val="single" w:sz="4" w:space="0" w:color="auto"/>
+          <w:left w:val="single" w:sz="4" w:space="0" w:color="auto"/>
+          <w:bottom w:val="single" w:sz="4" w:space="0" w:color="auto"/>
+          <w:right w:val="single" w:sz="4" w:space="0" w:color="auto"/>
+          <w:insideH w:val="single" w:sz="4" w:space="0" w:color="auto"/>
+          <w:insideV w:val="single" w:sz="4" w:space="0" w:color="auto"/>
+        </w:tblBorders>
         <w:tblCellMar>
           <w:top w:w="72" w:type="dxa"/>
           <w:left w:w="115" w:type="dxa"/>
@@ -7478,9 +7529,9 @@
         <w:tblDescription w:val="Table defining the standard interface assignments for TUC-R, the Tucson router. The table identifies each local interface, the connected device, and the corresponding remote interface used throughout the enterprise network."/>
       </w:tblPr>
       <w:tblGrid>
-        <w:gridCol w:w="2103"/>
-        <w:gridCol w:w="2666"/>
-        <w:gridCol w:w="2351"/>
+        <w:gridCol w:w="2123"/>
+        <w:gridCol w:w="2686"/>
+        <w:gridCol w:w="2371"/>
       </w:tblGrid>
       <w:tr>
         <w:trPr>
@@ -7889,6 +7940,14 @@
       <w:tblPr>
         <w:tblW w:w="0" w:type="auto"/>
         <w:tblCellSpacing w:w="15" w:type="dxa"/>
+        <w:tblBorders>
+          <w:top w:val="single" w:sz="4" w:space="0" w:color="auto"/>
+          <w:left w:val="single" w:sz="4" w:space="0" w:color="auto"/>
+          <w:bottom w:val="single" w:sz="4" w:space="0" w:color="auto"/>
+          <w:right w:val="single" w:sz="4" w:space="0" w:color="auto"/>
+          <w:insideH w:val="single" w:sz="4" w:space="0" w:color="auto"/>
+          <w:insideV w:val="single" w:sz="4" w:space="0" w:color="auto"/>
+        </w:tblBorders>
         <w:tblCellMar>
           <w:top w:w="72" w:type="dxa"/>
           <w:left w:w="115" w:type="dxa"/>
@@ -7900,9 +7959,9 @@
         <w:tblDescription w:val="Table defining the standard interface assignments for FLG-R3, the Flagstaff Sales Office router. The table identifies each local interface, the connected device, and the corresponding remote interface used throughout the enterprise network."/>
       </w:tblPr>
       <w:tblGrid>
-        <w:gridCol w:w="2103"/>
-        <w:gridCol w:w="2666"/>
-        <w:gridCol w:w="2351"/>
+        <w:gridCol w:w="2123"/>
+        <w:gridCol w:w="2686"/>
+        <w:gridCol w:w="2371"/>
       </w:tblGrid>
       <w:tr>
         <w:trPr>
@@ -8294,7 +8353,7 @@
         <w:rPr>
           <w:color w:val="4F6228" w:themeColor="accent3" w:themeShade="80"/>
         </w:rPr>
-        <w:pict>
+        <w:pict w14:anchorId="2A5DD5CA">
           <v:rect id="_x0000_i1045" style="width:468pt;height:2.5pt" o:hralign="center" o:hrstd="t" o:hrnoshade="t" o:hr="t" fillcolor="#4e6128 [1606]" stroked="f"/>
         </w:pict>
       </w:r>
@@ -8315,7 +8374,6 @@
         <w:pStyle w:val="Heading3"/>
       </w:pPr>
       <w:r>
-        <w:lastRenderedPageBreak/>
         <w:t>Switch Port Configuration Standards</w:t>
       </w:r>
     </w:p>
@@ -8448,16 +8506,8 @@
         <w:rPr>
           <w:rStyle w:val="Strong"/>
         </w:rPr>
-        <w:t xml:space="preserve"> </w:t>
-      </w:r>
-      <w:proofErr w:type="spellStart"/>
-      <w:r>
-        <w:rPr>
-          <w:rStyle w:val="Strong"/>
-        </w:rPr>
-        <w:t>switchports</w:t>
-      </w:r>
-      <w:proofErr w:type="spellEnd"/>
+        <w:t xml:space="preserve"> switchports</w:t>
+      </w:r>
       <w:r>
         <w:t xml:space="preserve"> – </w:t>
       </w:r>
@@ -8492,14 +8542,7 @@
         <w:rPr>
           <w:rStyle w:val="Strong"/>
         </w:rPr>
-        <w:t xml:space="preserve">and future expansion </w:t>
-      </w:r>
-      <w:proofErr w:type="spellStart"/>
-      <w:r>
-        <w:rPr>
-          <w:rStyle w:val="Strong"/>
-        </w:rPr>
-        <w:t>switch</w:t>
+        <w:t>and future expansion switch</w:t>
       </w:r>
       <w:r>
         <w:rPr>
@@ -8507,7 +8550,6 @@
         </w:rPr>
         <w:t>ports</w:t>
       </w:r>
-      <w:proofErr w:type="spellEnd"/>
       <w:r>
         <w:t xml:space="preserve"> – </w:t>
       </w:r>
@@ -8692,7 +8734,6 @@
           <w:b/>
           <w:bCs/>
         </w:rPr>
-        <w:lastRenderedPageBreak/>
         <w:t>Future expansion interfaces at remote sites</w:t>
       </w:r>
       <w:r>
@@ -8843,6 +8884,14 @@
       <w:tblPr>
         <w:tblW w:w="0" w:type="auto"/>
         <w:tblCellSpacing w:w="15" w:type="dxa"/>
+        <w:tblBorders>
+          <w:top w:val="single" w:sz="4" w:space="0" w:color="auto"/>
+          <w:left w:val="single" w:sz="4" w:space="0" w:color="auto"/>
+          <w:bottom w:val="single" w:sz="4" w:space="0" w:color="auto"/>
+          <w:right w:val="single" w:sz="4" w:space="0" w:color="auto"/>
+          <w:insideH w:val="single" w:sz="4" w:space="0" w:color="auto"/>
+          <w:insideV w:val="single" w:sz="4" w:space="0" w:color="auto"/>
+        </w:tblBorders>
         <w:tblCellMar>
           <w:top w:w="72" w:type="dxa"/>
           <w:left w:w="115" w:type="dxa"/>
@@ -8854,9 +8903,9 @@
         <w:tblDescription w:val="Table defining the standard interface assignments for HQ-S1, the primary Phoenix Headquarters switch. The table identifies each local interface, the connected device, and the corresponding remote interface. Reserved interface ranges are also identified for EtherChannel, DHCP client devices, and devices requiring static IP addresses."/>
       </w:tblPr>
       <w:tblGrid>
-        <w:gridCol w:w="2430"/>
-        <w:gridCol w:w="4410"/>
-        <w:gridCol w:w="2520"/>
+        <w:gridCol w:w="2428"/>
+        <w:gridCol w:w="4404"/>
+        <w:gridCol w:w="2518"/>
       </w:tblGrid>
       <w:tr>
         <w:trPr>
@@ -8887,7 +8936,6 @@
                 <w:sz w:val="28"/>
                 <w:szCs w:val="28"/>
               </w:rPr>
-              <w:lastRenderedPageBreak/>
               <w:t>Local Interface</w:t>
             </w:r>
           </w:p>
@@ -9325,15 +9373,7 @@
           </w:tcPr>
           <w:p>
             <w:r>
-              <w:t xml:space="preserve">Reserved - </w:t>
-            </w:r>
-            <w:proofErr w:type="spellStart"/>
-            <w:r>
-              <w:t>IoT</w:t>
-            </w:r>
-            <w:proofErr w:type="spellEnd"/>
-            <w:r>
-              <w:t>/Security Device</w:t>
+              <w:t>Reserved - IoT/Security Device</w:t>
             </w:r>
           </w:p>
         </w:tc>
@@ -9485,6 +9525,14 @@
       <w:tblPr>
         <w:tblW w:w="0" w:type="auto"/>
         <w:tblCellSpacing w:w="15" w:type="dxa"/>
+        <w:tblBorders>
+          <w:top w:val="single" w:sz="4" w:space="0" w:color="auto"/>
+          <w:left w:val="single" w:sz="4" w:space="0" w:color="auto"/>
+          <w:bottom w:val="single" w:sz="4" w:space="0" w:color="auto"/>
+          <w:right w:val="single" w:sz="4" w:space="0" w:color="auto"/>
+          <w:insideH w:val="single" w:sz="4" w:space="0" w:color="auto"/>
+          <w:insideV w:val="single" w:sz="4" w:space="0" w:color="auto"/>
+        </w:tblBorders>
         <w:tblCellMar>
           <w:top w:w="72" w:type="dxa"/>
           <w:left w:w="115" w:type="dxa"/>
@@ -9496,9 +9544,9 @@
         <w:tblDescription w:val="Table defining the standard interface assignments for HQ-S2, the secondary Phoenix Headquarters switch. The table identifies each local interface, the connected device, and the corresponding remote interface. Reserved interface ranges are also identified for EtherChannel, DHCP client devices, and devices requiring static IP addresses."/>
       </w:tblPr>
       <w:tblGrid>
-        <w:gridCol w:w="2430"/>
-        <w:gridCol w:w="4410"/>
-        <w:gridCol w:w="2520"/>
+        <w:gridCol w:w="2428"/>
+        <w:gridCol w:w="4404"/>
+        <w:gridCol w:w="2518"/>
       </w:tblGrid>
       <w:tr>
         <w:trPr>
@@ -9917,7 +9965,6 @@
           </w:tcPr>
           <w:p>
             <w:r>
-              <w:lastRenderedPageBreak/>
               <w:t>F0/15</w:t>
             </w:r>
           </w:p>
@@ -9967,15 +10014,7 @@
           </w:tcPr>
           <w:p>
             <w:r>
-              <w:t xml:space="preserve">Reserved - </w:t>
-            </w:r>
-            <w:proofErr w:type="spellStart"/>
-            <w:r>
-              <w:t>IoT</w:t>
-            </w:r>
-            <w:proofErr w:type="spellEnd"/>
-            <w:r>
-              <w:t>/Security Device</w:t>
+              <w:t>Reserved - IoT/Security Device</w:t>
             </w:r>
           </w:p>
         </w:tc>
@@ -10130,6 +10169,14 @@
       <w:tblPr>
         <w:tblW w:w="0" w:type="auto"/>
         <w:tblCellSpacing w:w="15" w:type="dxa"/>
+        <w:tblBorders>
+          <w:top w:val="single" w:sz="4" w:space="0" w:color="auto"/>
+          <w:left w:val="single" w:sz="4" w:space="0" w:color="auto"/>
+          <w:bottom w:val="single" w:sz="4" w:space="0" w:color="auto"/>
+          <w:right w:val="single" w:sz="4" w:space="0" w:color="auto"/>
+          <w:insideH w:val="single" w:sz="4" w:space="0" w:color="auto"/>
+          <w:insideV w:val="single" w:sz="4" w:space="0" w:color="auto"/>
+        </w:tblBorders>
         <w:tblCellMar>
           <w:top w:w="72" w:type="dxa"/>
           <w:left w:w="115" w:type="dxa"/>
@@ -10141,9 +10188,9 @@
         <w:tblDescription w:val="Table defining the standard interface assignments for TUC-S3, the Tucson Distribution Center switch. The table identifies each local interface, the connected device, and the corresponding remote interface. Reserved interface ranges are also identified for EtherChannel, DHCP client devices, and devices requiring static IP addresses."/>
       </w:tblPr>
       <w:tblGrid>
-        <w:gridCol w:w="2430"/>
-        <w:gridCol w:w="4410"/>
-        <w:gridCol w:w="2520"/>
+        <w:gridCol w:w="2428"/>
+        <w:gridCol w:w="4404"/>
+        <w:gridCol w:w="2518"/>
       </w:tblGrid>
       <w:tr>
         <w:trPr>
@@ -10303,13 +10350,8 @@
           </w:tcPr>
           <w:p>
             <w:r>
-              <w:t xml:space="preserve">Reserved for </w:t>
-            </w:r>
-            <w:proofErr w:type="spellStart"/>
-            <w:r>
-              <w:t>EtherChannel</w:t>
-            </w:r>
-            <w:proofErr w:type="spellEnd"/>
+              <w:t>Reserved for EtherChannel</w:t>
+            </w:r>
           </w:p>
         </w:tc>
         <w:tc>
@@ -10561,6 +10603,14 @@
       <w:tblPr>
         <w:tblW w:w="0" w:type="auto"/>
         <w:tblCellSpacing w:w="15" w:type="dxa"/>
+        <w:tblBorders>
+          <w:top w:val="single" w:sz="4" w:space="0" w:color="auto"/>
+          <w:left w:val="single" w:sz="4" w:space="0" w:color="auto"/>
+          <w:bottom w:val="single" w:sz="4" w:space="0" w:color="auto"/>
+          <w:right w:val="single" w:sz="4" w:space="0" w:color="auto"/>
+          <w:insideH w:val="single" w:sz="4" w:space="0" w:color="auto"/>
+          <w:insideV w:val="single" w:sz="4" w:space="0" w:color="auto"/>
+        </w:tblBorders>
         <w:tblCellMar>
           <w:top w:w="72" w:type="dxa"/>
           <w:left w:w="115" w:type="dxa"/>
@@ -10572,9 +10622,9 @@
         <w:tblDescription w:val="Table defining the standard interface assignments for FLG-S4, the Flagstaff Sales Office switch. The table identifies each local interface, the connected device, and the corresponding remote interface. Reserved interface ranges are also identified for EtherChannel, DHCP client devices, and devices requiring static IP addresses."/>
       </w:tblPr>
       <w:tblGrid>
-        <w:gridCol w:w="2430"/>
-        <w:gridCol w:w="4410"/>
-        <w:gridCol w:w="2520"/>
+        <w:gridCol w:w="2428"/>
+        <w:gridCol w:w="4404"/>
+        <w:gridCol w:w="2518"/>
       </w:tblGrid>
       <w:tr>
         <w:trPr>
@@ -10740,13 +10790,8 @@
               <w:t>for</w:t>
             </w:r>
             <w:r>
-              <w:t xml:space="preserve"> </w:t>
-            </w:r>
-            <w:proofErr w:type="spellStart"/>
-            <w:r>
-              <w:t>EtherChannel</w:t>
-            </w:r>
-            <w:proofErr w:type="spellEnd"/>
+              <w:t xml:space="preserve"> EtherChannel</w:t>
+            </w:r>
           </w:p>
         </w:tc>
         <w:tc>
@@ -10941,7 +10986,6 @@
           </w:tcPr>
           <w:p>
             <w:r>
-              <w:lastRenderedPageBreak/>
               <w:t>F0/20–F0/24</w:t>
             </w:r>
           </w:p>
@@ -10987,7 +11031,7 @@
         <w:rPr>
           <w:color w:val="4F6228" w:themeColor="accent3" w:themeShade="80"/>
         </w:rPr>
-        <w:pict>
+        <w:pict w14:anchorId="6CDF6791">
           <v:rect id="_x0000_i1046" style="width:468pt;height:2.5pt" o:hralign="center" o:hrstd="t" o:hrnoshade="t" o:hr="t" fillcolor="#4e6128 [1606]" stroked="f"/>
         </w:pict>
       </w:r>
@@ -11236,7 +11280,6 @@
         <w:spacing w:before="100" w:beforeAutospacing="1" w:after="100" w:afterAutospacing="1"/>
       </w:pPr>
       <w:r>
-        <w:lastRenderedPageBreak/>
         <w:t>Because both workspaces represent the same network, no separate</w:t>
       </w:r>
       <w:r>
@@ -11500,7 +11543,6 @@
           <w:sz w:val="20"/>
           <w:szCs w:val="20"/>
         </w:rPr>
-        <w:lastRenderedPageBreak/>
         <w:t xml:space="preserve">ECR-001 – Your </w:t>
       </w:r>
       <w:proofErr w:type="spellStart"/>
@@ -11624,7 +11666,7 @@
         <w:rPr>
           <w:color w:val="4F6228" w:themeColor="accent3" w:themeShade="80"/>
         </w:rPr>
-        <w:pict>
+        <w:pict w14:anchorId="519526ED">
           <v:rect id="_x0000_i1047" style="width:468pt;height:2.5pt" o:hralign="center" o:hrstd="t" o:hrnoshade="t" o:hr="t" fillcolor="#4e6128 [1606]" stroked="f"/>
         </w:pict>
       </w:r>
@@ -11838,8 +11880,6 @@
       <w:pPr>
         <w:jc w:val="center"/>
       </w:pPr>
-      <w:bookmarkStart w:id="0" w:name="_GoBack"/>
-      <w:bookmarkEnd w:id="0"/>
     </w:p>
     <w:sectPr>
       <w:headerReference w:type="default" r:id="rId8"/>
@@ -11854,7 +11894,7 @@
 </file>
 
 <file path=word/endnotes.xml><?xml version="1.0" encoding="utf-8"?>
-<w:endnotes xmlns:wpc="http://schemas.microsoft.com/office/word/2010/wordprocessingCanvas" xmlns:mc="http://schemas.openxmlformats.org/markup-compatibility/2006" xmlns:o="urn:schemas-microsoft-com:office:office" xmlns:r="http://schemas.openxmlformats.org/officeDocument/2006/relationships" xmlns:m="http://schemas.openxmlformats.org/officeDocument/2006/math" xmlns:v="urn:schemas-microsoft-com:vml" xmlns:wp14="http://schemas.microsoft.com/office/word/2010/wordprocessingDrawing" xmlns:wp="http://schemas.openxmlformats.org/drawingml/2006/wordprocessingDrawing" xmlns:w10="urn:schemas-microsoft-com:office:word" xmlns:w="http://schemas.openxmlformats.org/wordprocessingml/2006/main" xmlns:w14="http://schemas.microsoft.com/office/word/2010/wordml" xmlns:w15="http://schemas.microsoft.com/office/word/2012/wordml" xmlns:wpg="http://schemas.microsoft.com/office/word/2010/wordprocessingGroup" xmlns:wpi="http://schemas.microsoft.com/office/word/2010/wordprocessingInk" xmlns:wne="http://schemas.microsoft.com/office/word/2006/wordml" xmlns:wps="http://schemas.microsoft.com/office/word/2010/wordprocessingShape" mc:Ignorable="w14 w15 wp14">
+<w:endnotes xmlns:wpc="http://schemas.microsoft.com/office/word/2010/wordprocessingCanvas" xmlns:cx="http://schemas.microsoft.com/office/drawing/2014/chartex" xmlns:cx1="http://schemas.microsoft.com/office/drawing/2015/9/8/chartex" xmlns:cx2="http://schemas.microsoft.com/office/drawing/2015/10/21/chartex" xmlns:cx3="http://schemas.microsoft.com/office/drawing/2016/5/9/chartex" xmlns:cx4="http://schemas.microsoft.com/office/drawing/2016/5/10/chartex" xmlns:cx5="http://schemas.microsoft.com/office/drawing/2016/5/11/chartex" xmlns:cx6="http://schemas.microsoft.com/office/drawing/2016/5/12/chartex" xmlns:cx7="http://schemas.microsoft.com/office/drawing/2016/5/13/chartex" xmlns:cx8="http://schemas.microsoft.com/office/drawing/2016/5/14/chartex" xmlns:mc="http://schemas.openxmlformats.org/markup-compatibility/2006" xmlns:aink="http://schemas.microsoft.com/office/drawing/2016/ink" xmlns:am3d="http://schemas.microsoft.com/office/drawing/2017/model3d" xmlns:o="urn:schemas-microsoft-com:office:office" xmlns:oel="http://schemas.microsoft.com/office/2019/extlst" xmlns:r="http://schemas.openxmlformats.org/officeDocument/2006/relationships" xmlns:m="http://schemas.openxmlformats.org/officeDocument/2006/math" xmlns:v="urn:schemas-microsoft-com:vml" xmlns:wp14="http://schemas.microsoft.com/office/word/2010/wordprocessingDrawing" xmlns:wp="http://schemas.openxmlformats.org/drawingml/2006/wordprocessingDrawing" xmlns:w10="urn:schemas-microsoft-com:office:word" xmlns:w="http://schemas.openxmlformats.org/wordprocessingml/2006/main" xmlns:w14="http://schemas.microsoft.com/office/word/2010/wordml" xmlns:w15="http://schemas.microsoft.com/office/word/2012/wordml" xmlns:w16cex="http://schemas.microsoft.com/office/word/2018/wordml/cex" xmlns:w16cid="http://schemas.microsoft.com/office/word/2016/wordml/cid" xmlns:w16="http://schemas.microsoft.com/office/word/2018/wordml" xmlns:w16sdtdh="http://schemas.microsoft.com/office/word/2020/wordml/sdtdatahash" xmlns:w16se="http://schemas.microsoft.com/office/word/2015/wordml/symex" xmlns:wpg="http://schemas.microsoft.com/office/word/2010/wordprocessingGroup" xmlns:wpi="http://schemas.microsoft.com/office/word/2010/wordprocessingInk" xmlns:wne="http://schemas.microsoft.com/office/word/2006/wordml" xmlns:wps="http://schemas.microsoft.com/office/word/2010/wordprocessingShape" mc:Ignorable="w14 w15 w16se w16cid w16 w16cex w16sdtdh wp14">
   <w:endnote w:type="separator" w:id="-1">
     <w:p>
       <w:r>
@@ -11873,7 +11913,7 @@
 </file>
 
 <file path=word/footer1.xml><?xml version="1.0" encoding="utf-8"?>
-<w:ftr xmlns:wpc="http://schemas.microsoft.com/office/word/2010/wordprocessingCanvas" xmlns:mc="http://schemas.openxmlformats.org/markup-compatibility/2006" xmlns:o="urn:schemas-microsoft-com:office:office" xmlns:r="http://schemas.openxmlformats.org/officeDocument/2006/relationships" xmlns:m="http://schemas.openxmlformats.org/officeDocument/2006/math" xmlns:v="urn:schemas-microsoft-com:vml" xmlns:wp14="http://schemas.microsoft.com/office/word/2010/wordprocessingDrawing" xmlns:wp="http://schemas.openxmlformats.org/drawingml/2006/wordprocessingDrawing" xmlns:w10="urn:schemas-microsoft-com:office:word" xmlns:w="http://schemas.openxmlformats.org/wordprocessingml/2006/main" xmlns:w14="http://schemas.microsoft.com/office/word/2010/wordml" xmlns:w15="http://schemas.microsoft.com/office/word/2012/wordml" xmlns:wpg="http://schemas.microsoft.com/office/word/2010/wordprocessingGroup" xmlns:wpi="http://schemas.microsoft.com/office/word/2010/wordprocessingInk" xmlns:wne="http://schemas.microsoft.com/office/word/2006/wordml" xmlns:wps="http://schemas.microsoft.com/office/word/2010/wordprocessingShape" mc:Ignorable="w14 w15 wp14">
+<w:ftr xmlns:wpc="http://schemas.microsoft.com/office/word/2010/wordprocessingCanvas" xmlns:cx="http://schemas.microsoft.com/office/drawing/2014/chartex" xmlns:cx1="http://schemas.microsoft.com/office/drawing/2015/9/8/chartex" xmlns:cx2="http://schemas.microsoft.com/office/drawing/2015/10/21/chartex" xmlns:cx3="http://schemas.microsoft.com/office/drawing/2016/5/9/chartex" xmlns:cx4="http://schemas.microsoft.com/office/drawing/2016/5/10/chartex" xmlns:cx5="http://schemas.microsoft.com/office/drawing/2016/5/11/chartex" xmlns:cx6="http://schemas.microsoft.com/office/drawing/2016/5/12/chartex" xmlns:cx7="http://schemas.microsoft.com/office/drawing/2016/5/13/chartex" xmlns:cx8="http://schemas.microsoft.com/office/drawing/2016/5/14/chartex" xmlns:mc="http://schemas.openxmlformats.org/markup-compatibility/2006" xmlns:aink="http://schemas.microsoft.com/office/drawing/2016/ink" xmlns:am3d="http://schemas.microsoft.com/office/drawing/2017/model3d" xmlns:o="urn:schemas-microsoft-com:office:office" xmlns:oel="http://schemas.microsoft.com/office/2019/extlst" xmlns:r="http://schemas.openxmlformats.org/officeDocument/2006/relationships" xmlns:m="http://schemas.openxmlformats.org/officeDocument/2006/math" xmlns:v="urn:schemas-microsoft-com:vml" xmlns:wp14="http://schemas.microsoft.com/office/word/2010/wordprocessingDrawing" xmlns:wp="http://schemas.openxmlformats.org/drawingml/2006/wordprocessingDrawing" xmlns:w10="urn:schemas-microsoft-com:office:word" xmlns:w="http://schemas.openxmlformats.org/wordprocessingml/2006/main" xmlns:w14="http://schemas.microsoft.com/office/word/2010/wordml" xmlns:w15="http://schemas.microsoft.com/office/word/2012/wordml" xmlns:w16cex="http://schemas.microsoft.com/office/word/2018/wordml/cex" xmlns:w16cid="http://schemas.microsoft.com/office/word/2016/wordml/cid" xmlns:w16="http://schemas.microsoft.com/office/word/2018/wordml" xmlns:w16sdtdh="http://schemas.microsoft.com/office/word/2020/wordml/sdtdatahash" xmlns:w16se="http://schemas.microsoft.com/office/word/2015/wordml/symex" xmlns:wpg="http://schemas.microsoft.com/office/word/2010/wordprocessingGroup" xmlns:wpi="http://schemas.microsoft.com/office/word/2010/wordprocessingInk" xmlns:wne="http://schemas.microsoft.com/office/word/2006/wordml" xmlns:wps="http://schemas.microsoft.com/office/word/2010/wordprocessingShape" mc:Ignorable="w14 w15 w16se w16cid w16 w16cex w16sdtdh wp14">
   <w:p>
     <w:pPr>
       <w:pStyle w:val="Footer"/>
@@ -11882,7 +11922,7 @@
       <w:rPr>
         <w:color w:val="4F6228" w:themeColor="accent3" w:themeShade="80"/>
       </w:rPr>
-      <w:pict>
+      <w:pict w14:anchorId="4FB46E1E">
         <v:rect id="_x0000_i1048" style="width:468pt;height:2pt" o:hralign="center" o:hrstd="t" o:hrnoshade="t" o:hr="t" fillcolor="#4e6128 [1606]" stroked="f"/>
       </w:pict>
     </w:r>
@@ -11891,7 +11931,7 @@
 </file>
 
 <file path=word/footnotes.xml><?xml version="1.0" encoding="utf-8"?>
-<w:footnotes xmlns:wpc="http://schemas.microsoft.com/office/word/2010/wordprocessingCanvas" xmlns:mc="http://schemas.openxmlformats.org/markup-compatibility/2006" xmlns:o="urn:schemas-microsoft-com:office:office" xmlns:r="http://schemas.openxmlformats.org/officeDocument/2006/relationships" xmlns:m="http://schemas.openxmlformats.org/officeDocument/2006/math" xmlns:v="urn:schemas-microsoft-com:vml" xmlns:wp14="http://schemas.microsoft.com/office/word/2010/wordprocessingDrawing" xmlns:wp="http://schemas.openxmlformats.org/drawingml/2006/wordprocessingDrawing" xmlns:w10="urn:schemas-microsoft-com:office:word" xmlns:w="http://schemas.openxmlformats.org/wordprocessingml/2006/main" xmlns:w14="http://schemas.microsoft.com/office/word/2010/wordml" xmlns:w15="http://schemas.microsoft.com/office/word/2012/wordml" xmlns:wpg="http://schemas.microsoft.com/office/word/2010/wordprocessingGroup" xmlns:wpi="http://schemas.microsoft.com/office/word/2010/wordprocessingInk" xmlns:wne="http://schemas.microsoft.com/office/word/2006/wordml" xmlns:wps="http://schemas.microsoft.com/office/word/2010/wordprocessingShape" mc:Ignorable="w14 w15 wp14">
+<w:footnotes xmlns:wpc="http://schemas.microsoft.com/office/word/2010/wordprocessingCanvas" xmlns:cx="http://schemas.microsoft.com/office/drawing/2014/chartex" xmlns:cx1="http://schemas.microsoft.com/office/drawing/2015/9/8/chartex" xmlns:cx2="http://schemas.microsoft.com/office/drawing/2015/10/21/chartex" xmlns:cx3="http://schemas.microsoft.com/office/drawing/2016/5/9/chartex" xmlns:cx4="http://schemas.microsoft.com/office/drawing/2016/5/10/chartex" xmlns:cx5="http://schemas.microsoft.com/office/drawing/2016/5/11/chartex" xmlns:cx6="http://schemas.microsoft.com/office/drawing/2016/5/12/chartex" xmlns:cx7="http://schemas.microsoft.com/office/drawing/2016/5/13/chartex" xmlns:cx8="http://schemas.microsoft.com/office/drawing/2016/5/14/chartex" xmlns:mc="http://schemas.openxmlformats.org/markup-compatibility/2006" xmlns:aink="http://schemas.microsoft.com/office/drawing/2016/ink" xmlns:am3d="http://schemas.microsoft.com/office/drawing/2017/model3d" xmlns:o="urn:schemas-microsoft-com:office:office" xmlns:oel="http://schemas.microsoft.com/office/2019/extlst" xmlns:r="http://schemas.openxmlformats.org/officeDocument/2006/relationships" xmlns:m="http://schemas.openxmlformats.org/officeDocument/2006/math" xmlns:v="urn:schemas-microsoft-com:vml" xmlns:wp14="http://schemas.microsoft.com/office/word/2010/wordprocessingDrawing" xmlns:wp="http://schemas.openxmlformats.org/drawingml/2006/wordprocessingDrawing" xmlns:w10="urn:schemas-microsoft-com:office:word" xmlns:w="http://schemas.openxmlformats.org/wordprocessingml/2006/main" xmlns:w14="http://schemas.microsoft.com/office/word/2010/wordml" xmlns:w15="http://schemas.microsoft.com/office/word/2012/wordml" xmlns:w16cex="http://schemas.microsoft.com/office/word/2018/wordml/cex" xmlns:w16cid="http://schemas.microsoft.com/office/word/2016/wordml/cid" xmlns:w16="http://schemas.microsoft.com/office/word/2018/wordml" xmlns:w16sdtdh="http://schemas.microsoft.com/office/word/2020/wordml/sdtdatahash" xmlns:w16se="http://schemas.microsoft.com/office/word/2015/wordml/symex" xmlns:wpg="http://schemas.microsoft.com/office/word/2010/wordprocessingGroup" xmlns:wpi="http://schemas.microsoft.com/office/word/2010/wordprocessingInk" xmlns:wne="http://schemas.microsoft.com/office/word/2006/wordml" xmlns:wps="http://schemas.microsoft.com/office/word/2010/wordprocessingShape" mc:Ignorable="w14 w15 w16se w16cid w16 w16cex w16sdtdh wp14">
   <w:footnote w:type="separator" w:id="-1">
     <w:p>
       <w:r>
@@ -11910,7 +11950,7 @@
 </file>
 
 <file path=word/header1.xml><?xml version="1.0" encoding="utf-8"?>
-<w:hdr xmlns:wpc="http://schemas.microsoft.com/office/word/2010/wordprocessingCanvas" xmlns:mc="http://schemas.openxmlformats.org/markup-compatibility/2006" xmlns:o="urn:schemas-microsoft-com:office:office" xmlns:r="http://schemas.openxmlformats.org/officeDocument/2006/relationships" xmlns:m="http://schemas.openxmlformats.org/officeDocument/2006/math" xmlns:v="urn:schemas-microsoft-com:vml" xmlns:wp14="http://schemas.microsoft.com/office/word/2010/wordprocessingDrawing" xmlns:wp="http://schemas.openxmlformats.org/drawingml/2006/wordprocessingDrawing" xmlns:w10="urn:schemas-microsoft-com:office:word" xmlns:w="http://schemas.openxmlformats.org/wordprocessingml/2006/main" xmlns:w14="http://schemas.microsoft.com/office/word/2010/wordml" xmlns:w15="http://schemas.microsoft.com/office/word/2012/wordml" xmlns:wpg="http://schemas.microsoft.com/office/word/2010/wordprocessingGroup" xmlns:wpi="http://schemas.microsoft.com/office/word/2010/wordprocessingInk" xmlns:wne="http://schemas.microsoft.com/office/word/2006/wordml" xmlns:wps="http://schemas.microsoft.com/office/word/2010/wordprocessingShape" mc:Ignorable="w14 w15 wp14">
+<w:hdr xmlns:wpc="http://schemas.microsoft.com/office/word/2010/wordprocessingCanvas" xmlns:cx="http://schemas.microsoft.com/office/drawing/2014/chartex" xmlns:cx1="http://schemas.microsoft.com/office/drawing/2015/9/8/chartex" xmlns:cx2="http://schemas.microsoft.com/office/drawing/2015/10/21/chartex" xmlns:cx3="http://schemas.microsoft.com/office/drawing/2016/5/9/chartex" xmlns:cx4="http://schemas.microsoft.com/office/drawing/2016/5/10/chartex" xmlns:cx5="http://schemas.microsoft.com/office/drawing/2016/5/11/chartex" xmlns:cx6="http://schemas.microsoft.com/office/drawing/2016/5/12/chartex" xmlns:cx7="http://schemas.microsoft.com/office/drawing/2016/5/13/chartex" xmlns:cx8="http://schemas.microsoft.com/office/drawing/2016/5/14/chartex" xmlns:mc="http://schemas.openxmlformats.org/markup-compatibility/2006" xmlns:aink="http://schemas.microsoft.com/office/drawing/2016/ink" xmlns:am3d="http://schemas.microsoft.com/office/drawing/2017/model3d" xmlns:o="urn:schemas-microsoft-com:office:office" xmlns:oel="http://schemas.microsoft.com/office/2019/extlst" xmlns:r="http://schemas.openxmlformats.org/officeDocument/2006/relationships" xmlns:m="http://schemas.openxmlformats.org/officeDocument/2006/math" xmlns:v="urn:schemas-microsoft-com:vml" xmlns:wp14="http://schemas.microsoft.com/office/word/2010/wordprocessingDrawing" xmlns:wp="http://schemas.openxmlformats.org/drawingml/2006/wordprocessingDrawing" xmlns:w10="urn:schemas-microsoft-com:office:word" xmlns:w="http://schemas.openxmlformats.org/wordprocessingml/2006/main" xmlns:w14="http://schemas.microsoft.com/office/word/2010/wordml" xmlns:w15="http://schemas.microsoft.com/office/word/2012/wordml" xmlns:w16cex="http://schemas.microsoft.com/office/word/2018/wordml/cex" xmlns:w16cid="http://schemas.microsoft.com/office/word/2016/wordml/cid" xmlns:w16="http://schemas.microsoft.com/office/word/2018/wordml" xmlns:w16sdtdh="http://schemas.microsoft.com/office/word/2020/wordml/sdtdatahash" xmlns:w16se="http://schemas.microsoft.com/office/word/2015/wordml/symex" xmlns:wpg="http://schemas.microsoft.com/office/word/2010/wordprocessingGroup" xmlns:wpi="http://schemas.microsoft.com/office/word/2010/wordprocessingInk" xmlns:wne="http://schemas.microsoft.com/office/word/2006/wordml" xmlns:wps="http://schemas.microsoft.com/office/word/2010/wordprocessingShape" mc:Ignorable="w14 w15 w16se w16cid w16 w16cex w16sdtdh wp14">
   <w:p>
     <w:pPr>
       <w:pStyle w:val="Header"/>
@@ -11921,7 +11961,7 @@
         <w:noProof/>
       </w:rPr>
       <w:drawing>
-        <wp:inline distT="0" distB="0" distL="0" distR="0">
+        <wp:inline distT="0" distB="0" distL="0" distR="0" wp14:anchorId="1E095295" wp14:editId="66B1D7E6">
           <wp:extent cx="5709920" cy="1414145"/>
           <wp:effectExtent l="0" t="0" r="5080" b="0"/>
           <wp:docPr id="2" name="Picture 2" descr="Sonoran Outdoor Equipment logo featuring a hiking desert tortoise with Arizona mountains and a saguaro cactus." title="Document Header"/>
@@ -11976,7 +12016,7 @@
 </file>
 
 <file path=word/numbering.xml><?xml version="1.0" encoding="utf-8"?>
-<w:numbering xmlns:wpc="http://schemas.microsoft.com/office/word/2010/wordprocessingCanvas" xmlns:mc="http://schemas.openxmlformats.org/markup-compatibility/2006" xmlns:o="urn:schemas-microsoft-com:office:office" xmlns:r="http://schemas.openxmlformats.org/officeDocument/2006/relationships" xmlns:m="http://schemas.openxmlformats.org/officeDocument/2006/math" xmlns:v="urn:schemas-microsoft-com:vml" xmlns:wp14="http://schemas.microsoft.com/office/word/2010/wordprocessingDrawing" xmlns:wp="http://schemas.openxmlformats.org/drawingml/2006/wordprocessingDrawing" xmlns:w10="urn:schemas-microsoft-com:office:word" xmlns:w="http://schemas.openxmlformats.org/wordprocessingml/2006/main" xmlns:w14="http://schemas.microsoft.com/office/word/2010/wordml" xmlns:w15="http://schemas.microsoft.com/office/word/2012/wordml" xmlns:wpg="http://schemas.microsoft.com/office/word/2010/wordprocessingGroup" xmlns:wpi="http://schemas.microsoft.com/office/word/2010/wordprocessingInk" xmlns:wne="http://schemas.microsoft.com/office/word/2006/wordml" xmlns:wps="http://schemas.microsoft.com/office/word/2010/wordprocessingShape" mc:Ignorable="w14 w15 wp14">
+<w:numbering xmlns:wpc="http://schemas.microsoft.com/office/word/2010/wordprocessingCanvas" xmlns:cx="http://schemas.microsoft.com/office/drawing/2014/chartex" xmlns:cx1="http://schemas.microsoft.com/office/drawing/2015/9/8/chartex" xmlns:cx2="http://schemas.microsoft.com/office/drawing/2015/10/21/chartex" xmlns:cx3="http://schemas.microsoft.com/office/drawing/2016/5/9/chartex" xmlns:cx4="http://schemas.microsoft.com/office/drawing/2016/5/10/chartex" xmlns:cx5="http://schemas.microsoft.com/office/drawing/2016/5/11/chartex" xmlns:cx6="http://schemas.microsoft.com/office/drawing/2016/5/12/chartex" xmlns:cx7="http://schemas.microsoft.com/office/drawing/2016/5/13/chartex" xmlns:cx8="http://schemas.microsoft.com/office/drawing/2016/5/14/chartex" xmlns:mc="http://schemas.openxmlformats.org/markup-compatibility/2006" xmlns:aink="http://schemas.microsoft.com/office/drawing/2016/ink" xmlns:am3d="http://schemas.microsoft.com/office/drawing/2017/model3d" xmlns:o="urn:schemas-microsoft-com:office:office" xmlns:oel="http://schemas.microsoft.com/office/2019/extlst" xmlns:r="http://schemas.openxmlformats.org/officeDocument/2006/relationships" xmlns:m="http://schemas.openxmlformats.org/officeDocument/2006/math" xmlns:v="urn:schemas-microsoft-com:vml" xmlns:wp14="http://schemas.microsoft.com/office/word/2010/wordprocessingDrawing" xmlns:wp="http://schemas.openxmlformats.org/drawingml/2006/wordprocessingDrawing" xmlns:w10="urn:schemas-microsoft-com:office:word" xmlns:w="http://schemas.openxmlformats.org/wordprocessingml/2006/main" xmlns:w14="http://schemas.microsoft.com/office/word/2010/wordml" xmlns:w15="http://schemas.microsoft.com/office/word/2012/wordml" xmlns:w16cex="http://schemas.microsoft.com/office/word/2018/wordml/cex" xmlns:w16cid="http://schemas.microsoft.com/office/word/2016/wordml/cid" xmlns:w16="http://schemas.microsoft.com/office/word/2018/wordml" xmlns:w16sdtdh="http://schemas.microsoft.com/office/word/2020/wordml/sdtdatahash" xmlns:w16se="http://schemas.microsoft.com/office/word/2015/wordml/symex" xmlns:wpg="http://schemas.microsoft.com/office/word/2010/wordprocessingGroup" xmlns:wpi="http://schemas.microsoft.com/office/word/2010/wordprocessingInk" xmlns:wne="http://schemas.microsoft.com/office/word/2006/wordml" xmlns:wps="http://schemas.microsoft.com/office/word/2010/wordprocessingShape" mc:Ignorable="w14 w15 w16se w16cid w16 w16cex w16sdtdh wp14">
   <w:abstractNum w:abstractNumId="0" w15:restartNumberingAfterBreak="0">
     <w:nsid w:val="FFFFFF7E"/>
     <w:multiLevelType w:val="singleLevel"/>
@@ -17278,133 +17318,133 @@
       </w:rPr>
     </w:lvl>
   </w:abstractNum>
-  <w:num w:numId="1">
+  <w:num w:numId="1" w16cid:durableId="1565136801">
     <w:abstractNumId w:val="5"/>
   </w:num>
-  <w:num w:numId="2">
+  <w:num w:numId="2" w16cid:durableId="165051533">
     <w:abstractNumId w:val="3"/>
   </w:num>
-  <w:num w:numId="3">
+  <w:num w:numId="3" w16cid:durableId="1136751961">
     <w:abstractNumId w:val="2"/>
   </w:num>
-  <w:num w:numId="4">
+  <w:num w:numId="4" w16cid:durableId="1577399008">
     <w:abstractNumId w:val="4"/>
   </w:num>
-  <w:num w:numId="5">
+  <w:num w:numId="5" w16cid:durableId="583954522">
     <w:abstractNumId w:val="1"/>
   </w:num>
-  <w:num w:numId="6">
+  <w:num w:numId="6" w16cid:durableId="369957160">
     <w:abstractNumId w:val="0"/>
   </w:num>
-  <w:num w:numId="7">
+  <w:num w:numId="7" w16cid:durableId="1722053163">
     <w:abstractNumId w:val="33"/>
   </w:num>
-  <w:num w:numId="8">
+  <w:num w:numId="8" w16cid:durableId="173035540">
     <w:abstractNumId w:val="35"/>
   </w:num>
-  <w:num w:numId="9">
+  <w:num w:numId="9" w16cid:durableId="1873611092">
     <w:abstractNumId w:val="25"/>
   </w:num>
-  <w:num w:numId="10">
+  <w:num w:numId="10" w16cid:durableId="2122263418">
     <w:abstractNumId w:val="19"/>
   </w:num>
-  <w:num w:numId="11">
+  <w:num w:numId="11" w16cid:durableId="692344167">
     <w:abstractNumId w:val="11"/>
   </w:num>
-  <w:num w:numId="12">
+  <w:num w:numId="12" w16cid:durableId="247083852">
     <w:abstractNumId w:val="31"/>
   </w:num>
-  <w:num w:numId="13">
+  <w:num w:numId="13" w16cid:durableId="192890193">
     <w:abstractNumId w:val="8"/>
   </w:num>
-  <w:num w:numId="14">
+  <w:num w:numId="14" w16cid:durableId="1680498266">
     <w:abstractNumId w:val="13"/>
   </w:num>
-  <w:num w:numId="15">
+  <w:num w:numId="15" w16cid:durableId="200098480">
     <w:abstractNumId w:val="41"/>
   </w:num>
-  <w:num w:numId="16">
+  <w:num w:numId="16" w16cid:durableId="1672101329">
     <w:abstractNumId w:val="28"/>
   </w:num>
-  <w:num w:numId="17">
+  <w:num w:numId="17" w16cid:durableId="1067070514">
     <w:abstractNumId w:val="18"/>
   </w:num>
-  <w:num w:numId="18">
+  <w:num w:numId="18" w16cid:durableId="1072116637">
     <w:abstractNumId w:val="24"/>
   </w:num>
-  <w:num w:numId="19">
+  <w:num w:numId="19" w16cid:durableId="1552616203">
     <w:abstractNumId w:val="42"/>
   </w:num>
-  <w:num w:numId="20">
+  <w:num w:numId="20" w16cid:durableId="1942370378">
     <w:abstractNumId w:val="10"/>
   </w:num>
-  <w:num w:numId="21">
+  <w:num w:numId="21" w16cid:durableId="1123498070">
     <w:abstractNumId w:val="9"/>
   </w:num>
-  <w:num w:numId="22">
+  <w:num w:numId="22" w16cid:durableId="842085358">
     <w:abstractNumId w:val="21"/>
   </w:num>
-  <w:num w:numId="23">
+  <w:num w:numId="23" w16cid:durableId="711542063">
     <w:abstractNumId w:val="6"/>
   </w:num>
-  <w:num w:numId="24">
+  <w:num w:numId="24" w16cid:durableId="1979214833">
     <w:abstractNumId w:val="23"/>
   </w:num>
-  <w:num w:numId="25">
+  <w:num w:numId="25" w16cid:durableId="45959932">
     <w:abstractNumId w:val="39"/>
   </w:num>
-  <w:num w:numId="26">
+  <w:num w:numId="26" w16cid:durableId="1743790961">
     <w:abstractNumId w:val="7"/>
   </w:num>
-  <w:num w:numId="27">
+  <w:num w:numId="27" w16cid:durableId="646864629">
     <w:abstractNumId w:val="40"/>
   </w:num>
-  <w:num w:numId="28">
+  <w:num w:numId="28" w16cid:durableId="530387132">
     <w:abstractNumId w:val="29"/>
   </w:num>
-  <w:num w:numId="29">
+  <w:num w:numId="29" w16cid:durableId="506137869">
     <w:abstractNumId w:val="17"/>
   </w:num>
-  <w:num w:numId="30">
+  <w:num w:numId="30" w16cid:durableId="446658233">
     <w:abstractNumId w:val="32"/>
   </w:num>
-  <w:num w:numId="31">
+  <w:num w:numId="31" w16cid:durableId="1249076627">
     <w:abstractNumId w:val="14"/>
   </w:num>
-  <w:num w:numId="32">
+  <w:num w:numId="32" w16cid:durableId="867521848">
     <w:abstractNumId w:val="27"/>
   </w:num>
-  <w:num w:numId="33">
+  <w:num w:numId="33" w16cid:durableId="1029450212">
     <w:abstractNumId w:val="12"/>
   </w:num>
-  <w:num w:numId="34">
+  <w:num w:numId="34" w16cid:durableId="570582296">
     <w:abstractNumId w:val="38"/>
   </w:num>
-  <w:num w:numId="35">
+  <w:num w:numId="35" w16cid:durableId="1889494716">
     <w:abstractNumId w:val="16"/>
   </w:num>
-  <w:num w:numId="36">
+  <w:num w:numId="36" w16cid:durableId="1525554312">
     <w:abstractNumId w:val="37"/>
   </w:num>
-  <w:num w:numId="37">
+  <w:num w:numId="37" w16cid:durableId="1370569523">
     <w:abstractNumId w:val="30"/>
   </w:num>
-  <w:num w:numId="38">
+  <w:num w:numId="38" w16cid:durableId="968779110">
     <w:abstractNumId w:val="15"/>
   </w:num>
-  <w:num w:numId="39">
+  <w:num w:numId="39" w16cid:durableId="2061859983">
     <w:abstractNumId w:val="26"/>
   </w:num>
-  <w:num w:numId="40">
+  <w:num w:numId="40" w16cid:durableId="1560826066">
     <w:abstractNumId w:val="34"/>
   </w:num>
-  <w:num w:numId="41">
+  <w:num w:numId="41" w16cid:durableId="1219827568">
     <w:abstractNumId w:val="36"/>
   </w:num>
-  <w:num w:numId="42">
+  <w:num w:numId="42" w16cid:durableId="1227376880">
     <w:abstractNumId w:val="20"/>
   </w:num>
-  <w:num w:numId="43">
+  <w:num w:numId="43" w16cid:durableId="715931848">
     <w:abstractNumId w:val="22"/>
   </w:num>
   <w:numIdMacAtCleanup w:val="34"/>
@@ -17412,7 +17452,7 @@
 </file>
 
 <file path=word/styles.xml><?xml version="1.0" encoding="utf-8"?>
-<w:styles xmlns:mc="http://schemas.openxmlformats.org/markup-compatibility/2006" xmlns:r="http://schemas.openxmlformats.org/officeDocument/2006/relationships" xmlns:w="http://schemas.openxmlformats.org/wordprocessingml/2006/main" xmlns:w14="http://schemas.microsoft.com/office/word/2010/wordml" xmlns:w15="http://schemas.microsoft.com/office/word/2012/wordml" mc:Ignorable="w14 w15">
+<w:styles xmlns:mc="http://schemas.openxmlformats.org/markup-compatibility/2006" xmlns:r="http://schemas.openxmlformats.org/officeDocument/2006/relationships" xmlns:w="http://schemas.openxmlformats.org/wordprocessingml/2006/main" xmlns:w14="http://schemas.microsoft.com/office/word/2010/wordml" xmlns:w15="http://schemas.microsoft.com/office/word/2012/wordml" xmlns:w16cex="http://schemas.microsoft.com/office/word/2018/wordml/cex" xmlns:w16cid="http://schemas.microsoft.com/office/word/2016/wordml/cid" xmlns:w16="http://schemas.microsoft.com/office/word/2018/wordml" xmlns:w16sdtdh="http://schemas.microsoft.com/office/word/2020/wordml/sdtdatahash" xmlns:w16se="http://schemas.microsoft.com/office/word/2015/wordml/symex" mc:Ignorable="w14 w15 w16se w16cid w16 w16cex w16sdtdh">
   <w:docDefaults>
     <w:rPrDefault>
       <w:rPr>
@@ -17428,7 +17468,7 @@
       </w:pPr>
     </w:pPrDefault>
   </w:docDefaults>
-  <w:latentStyles w:defLockedState="0" w:defUIPriority="99" w:defSemiHidden="0" w:defUnhideWhenUsed="0" w:defQFormat="0" w:count="371">
+  <w:latentStyles w:defLockedState="0" w:defUIPriority="99" w:defSemiHidden="0" w:defUnhideWhenUsed="0" w:defQFormat="0" w:count="376">
     <w:lsdException w:name="Normal" w:uiPriority="0" w:qFormat="1"/>
     <w:lsdException w:name="heading 1" w:uiPriority="9" w:qFormat="1"/>
     <w:lsdException w:name="heading 2" w:semiHidden="1" w:uiPriority="9" w:unhideWhenUsed="1" w:qFormat="1"/>
@@ -17791,6 +17831,11 @@
     <w:lsdException w:name="List Table 5 Dark Accent 6" w:uiPriority="50"/>
     <w:lsdException w:name="List Table 6 Colorful Accent 6" w:uiPriority="51"/>
     <w:lsdException w:name="List Table 7 Colorful Accent 6" w:uiPriority="52"/>
+    <w:lsdException w:name="Mention" w:semiHidden="1" w:unhideWhenUsed="1"/>
+    <w:lsdException w:name="Smart Hyperlink" w:semiHidden="1" w:unhideWhenUsed="1"/>
+    <w:lsdException w:name="Hashtag" w:semiHidden="1" w:unhideWhenUsed="1"/>
+    <w:lsdException w:name="Unresolved Mention" w:semiHidden="1" w:unhideWhenUsed="1"/>
+    <w:lsdException w:name="Smart Link" w:semiHidden="1" w:unhideWhenUsed="1"/>
   </w:latentStyles>
   <w:style w:type="paragraph" w:default="1" w:styleId="Normal">
     <w:name w:val="Normal"/>

</xml_diff>